<commit_message>
Desenvolvimento parcial das documentações do TCC
Folha de Aprovação, Banner TCC e Termo de Autorização
</commit_message>
<xml_diff>
--- a/Documentação/Folha de Aprovação.docx
+++ b/Documentação/Folha de Aprovação.docx
@@ -4,32 +4,24 @@
   <w:body>
     <w:p>
       <w:pPr>
-        <w:rPr>
-          <w:rFonts w:ascii="Arial" w:hAnsi="Arial" w:cs="Arial"/>
-        </w:rPr>
-      </w:pPr>
-    </w:p>
-    <w:p>
-      <w:pPr>
-        <w:rPr>
-          <w:rFonts w:ascii="Arial" w:hAnsi="Arial" w:cs="Arial"/>
-        </w:rPr>
-      </w:pPr>
-    </w:p>
-    <w:p>
-      <w:pPr>
         <w:keepNext/>
         <w:keepLines/>
         <w:jc w:val="center"/>
         <w:rPr>
           <w:rFonts w:ascii="Arial" w:hAnsi="Arial" w:cs="Arial"/>
-          <w:color w:val="FF0000"/>
-        </w:rPr>
-      </w:pPr>
-      <w:r>
-        <w:rPr>
-          <w:rFonts w:ascii="Arial" w:hAnsi="Arial" w:cs="Arial"/>
-          <w:noProof/>
+          <w:bCs/>
+          <w:color w:val="FF0000"/>
+          <w:sz w:val="22"/>
+          <w:szCs w:val="22"/>
+        </w:rPr>
+      </w:pPr>
+      <w:r>
+        <w:rPr>
+          <w:rFonts w:ascii="Arial" w:hAnsi="Arial" w:cs="Arial"/>
+          <w:bCs/>
+          <w:color w:val="FF0000"/>
+          <w:sz w:val="22"/>
+          <w:szCs w:val="22"/>
         </w:rPr>
         <mc:AlternateContent>
           <mc:Choice Requires="wps">
@@ -115,9 +107,84 @@
       <w:r>
         <w:rPr>
           <w:rFonts w:ascii="Arial" w:hAnsi="Arial" w:cs="Arial"/>
-          <w:color w:val="FF0000"/>
-        </w:rPr>
-        <w:t>Nome Completo do Autor</w:t>
+          <w:bCs/>
+          <w:color w:val="FF0000"/>
+          <w:sz w:val="22"/>
+          <w:szCs w:val="22"/>
+        </w:rPr>
+        <w:t>Davi Delmondes Machado</w:t>
+      </w:r>
+    </w:p>
+    <w:p>
+      <w:pPr>
+        <w:keepNext/>
+        <w:keepLines/>
+        <w:jc w:val="center"/>
+        <w:rPr>
+          <w:rFonts w:ascii="Arial" w:hAnsi="Arial" w:cs="Arial"/>
+          <w:bCs/>
+          <w:color w:val="FF0000"/>
+          <w:sz w:val="22"/>
+          <w:szCs w:val="22"/>
+        </w:rPr>
+      </w:pPr>
+      <w:r>
+        <w:rPr>
+          <w:rFonts w:ascii="Arial" w:hAnsi="Arial" w:cs="Arial"/>
+          <w:bCs/>
+          <w:color w:val="FF0000"/>
+          <w:sz w:val="22"/>
+          <w:szCs w:val="22"/>
+        </w:rPr>
+        <w:t>Igor de Oliveira Bernardo</w:t>
+      </w:r>
+    </w:p>
+    <w:p>
+      <w:pPr>
+        <w:keepNext/>
+        <w:keepLines/>
+        <w:jc w:val="center"/>
+        <w:rPr>
+          <w:rFonts w:ascii="Arial" w:hAnsi="Arial" w:cs="Arial"/>
+          <w:bCs/>
+          <w:color w:val="FF0000"/>
+          <w:sz w:val="22"/>
+          <w:szCs w:val="22"/>
+        </w:rPr>
+      </w:pPr>
+      <w:r>
+        <w:rPr>
+          <w:rFonts w:ascii="Arial" w:hAnsi="Arial" w:cs="Arial"/>
+          <w:bCs/>
+          <w:color w:val="FF0000"/>
+          <w:sz w:val="22"/>
+          <w:szCs w:val="22"/>
+        </w:rPr>
+        <w:t>João Pedro Bernardes Cardoso</w:t>
+      </w:r>
+    </w:p>
+    <w:p>
+      <w:pPr>
+        <w:keepNext/>
+        <w:keepLines/>
+        <w:jc w:val="center"/>
+        <w:rPr>
+          <w:rFonts w:ascii="Arial" w:hAnsi="Arial" w:cs="Arial"/>
+          <w:bCs/>
+          <w:color w:val="FF0000"/>
+          <w:sz w:val="22"/>
+          <w:szCs w:val="22"/>
+        </w:rPr>
+      </w:pPr>
+      <w:r>
+        <w:rPr>
+          <w:rFonts w:ascii="Arial" w:hAnsi="Arial" w:cs="Arial"/>
+          <w:bCs/>
+          <w:color w:val="FF0000"/>
+          <w:sz w:val="22"/>
+          <w:szCs w:val="22"/>
+        </w:rPr>
+        <w:t>Joaquim Pereira Lima</w:t>
       </w:r>
     </w:p>
     <w:p>
@@ -168,28 +235,29 @@
           <w:sz w:val="28"/>
           <w:szCs w:val="28"/>
         </w:rPr>
-        <w:t>TÍTULO</w:t>
-      </w:r>
-    </w:p>
-    <w:p>
-      <w:pPr>
-        <w:keepNext/>
-        <w:keepLines/>
-        <w:jc w:val="center"/>
+        <w:t xml:space="preserve">SIGEPI – SISTEMA WEB DE GERENCIAMENTO DE </w:t>
+      </w:r>
+      <w:r>
         <w:rPr>
           <w:rFonts w:ascii="Arial" w:hAnsi="Arial" w:cs="Arial"/>
           <w:b/>
           <w:color w:val="FF0000"/>
-        </w:rPr>
-      </w:pPr>
-      <w:r>
+          <w:sz w:val="28"/>
+          <w:szCs w:val="28"/>
+        </w:rPr>
+        <w:t>EQUIPAMENTOS DE PROTEÇÃO INDIVIDUAL (EPI)</w:t>
+      </w:r>
+    </w:p>
+    <w:p>
+      <w:pPr>
+        <w:keepNext/>
+        <w:keepLines/>
         <w:rPr>
           <w:rFonts w:ascii="Arial" w:hAnsi="Arial" w:cs="Arial"/>
           <w:b/>
           <w:color w:val="FF0000"/>
         </w:rPr>
-        <w:t>Subtítulo (se houver)</w:t>
-      </w:r>
+      </w:pPr>
     </w:p>
     <w:p>
       <w:pPr>
@@ -261,19 +329,7 @@
         <w:rPr>
           <w:rFonts w:ascii="Arial" w:hAnsi="Arial" w:cs="Arial"/>
         </w:rPr>
-        <w:t>_______</w:t>
-      </w:r>
-      <w:r>
-        <w:rPr>
-          <w:rFonts w:ascii="Arial" w:hAnsi="Arial" w:cs="Arial"/>
-        </w:rPr>
-        <w:t>______</w:t>
-      </w:r>
-      <w:r>
-        <w:rPr>
-          <w:rFonts w:ascii="Arial" w:hAnsi="Arial" w:cs="Arial"/>
-        </w:rPr>
-        <w:t>___</w:t>
+        <w:t>Desenvolvimento de Sistemas</w:t>
       </w:r>
       <w:r>
         <w:rPr>
@@ -391,19 +447,7 @@
         <w:rPr>
           <w:rFonts w:ascii="Arial" w:hAnsi="Arial" w:cs="Arial"/>
         </w:rPr>
-        <w:t>___</w:t>
-      </w:r>
-      <w:r>
-        <w:rPr>
-          <w:rFonts w:ascii="Arial" w:hAnsi="Arial" w:cs="Arial"/>
-        </w:rPr>
-        <w:t>_</w:t>
-      </w:r>
-      <w:r>
-        <w:rPr>
-          <w:rFonts w:ascii="Arial" w:hAnsi="Arial" w:cs="Arial"/>
-        </w:rPr>
-        <w:t>__</w:t>
+        <w:t>18</w:t>
       </w:r>
       <w:r>
         <w:rPr>
@@ -422,137 +466,222 @@
         <w:rPr>
           <w:rFonts w:ascii="Arial" w:hAnsi="Arial" w:cs="Arial"/>
         </w:rPr>
-        <w:t>____</w:t>
-      </w:r>
-      <w:r>
-        <w:rPr>
-          <w:rFonts w:ascii="Arial" w:hAnsi="Arial" w:cs="Arial"/>
-        </w:rPr>
-        <w:t>___</w:t>
-      </w:r>
-      <w:r>
-        <w:rPr>
-          <w:rFonts w:ascii="Arial" w:hAnsi="Arial" w:cs="Arial"/>
-        </w:rPr>
-        <w:t>__</w:t>
-      </w:r>
-      <w:r>
-        <w:rPr>
-          <w:rFonts w:ascii="Arial" w:hAnsi="Arial" w:cs="Arial"/>
-        </w:rPr>
-        <w:t>__</w:t>
-      </w:r>
-      <w:r>
-        <w:rPr>
-          <w:rFonts w:ascii="Arial" w:hAnsi="Arial" w:cs="Arial"/>
-        </w:rPr>
-        <w:t>__</w:t>
-      </w:r>
-      <w:r>
-        <w:rPr>
-          <w:rFonts w:ascii="Arial" w:hAnsi="Arial" w:cs="Arial"/>
-        </w:rPr>
-        <w:t xml:space="preserve"> </w:t>
+        <w:t>novembro</w:t>
+      </w:r>
+      <w:r>
+        <w:rPr>
+          <w:rFonts w:ascii="Arial" w:hAnsi="Arial" w:cs="Arial"/>
+        </w:rPr>
+        <w:t xml:space="preserve"> de </w:t>
+      </w:r>
+      <w:r>
+        <w:rPr>
+          <w:rFonts w:ascii="Arial" w:hAnsi="Arial" w:cs="Arial"/>
+        </w:rPr>
+        <w:t>202</w:t>
+      </w:r>
+      <w:r>
+        <w:rPr>
+          <w:rFonts w:ascii="Arial" w:hAnsi="Arial" w:cs="Arial"/>
+        </w:rPr>
+        <w:t>6.</w:t>
+      </w:r>
+    </w:p>
+    <w:p>
+      <w:pPr>
+        <w:keepNext/>
+        <w:keepLines/>
+        <w:rPr>
+          <w:rFonts w:ascii="Arial" w:hAnsi="Arial" w:cs="Arial"/>
+        </w:rPr>
+      </w:pPr>
+    </w:p>
+    <w:p>
+      <w:pPr>
+        <w:keepNext/>
+        <w:keepLines/>
+        <w:rPr>
+          <w:rFonts w:ascii="Arial" w:hAnsi="Arial" w:cs="Arial"/>
+          <w:b/>
+        </w:rPr>
+      </w:pPr>
+    </w:p>
+    <w:p>
+      <w:pPr>
+        <w:keepNext/>
+        <w:keepLines/>
+        <w:rPr>
+          <w:rFonts w:ascii="Arial" w:hAnsi="Arial" w:cs="Arial"/>
+          <w:b/>
+        </w:rPr>
+      </w:pPr>
+      <w:r>
+        <w:rPr>
+          <w:rFonts w:ascii="Arial" w:hAnsi="Arial" w:cs="Arial"/>
+          <w:b/>
+        </w:rPr>
+        <w:t>Banca Examinadora:</w:t>
+      </w:r>
+    </w:p>
+    <w:p>
+      <w:pPr>
+        <w:keepNext/>
+        <w:keepLines/>
+        <w:rPr>
+          <w:rFonts w:ascii="Arial" w:hAnsi="Arial" w:cs="Arial"/>
+        </w:rPr>
+      </w:pPr>
+    </w:p>
+    <w:p>
+      <w:pPr>
+        <w:keepNext/>
+        <w:keepLines/>
+        <w:rPr>
+          <w:rFonts w:ascii="Arial" w:hAnsi="Arial" w:cs="Arial"/>
+        </w:rPr>
+      </w:pPr>
+    </w:p>
+    <w:p>
+      <w:pPr>
+        <w:keepNext/>
+        <w:keepLines/>
+        <w:rPr>
+          <w:rFonts w:ascii="Arial" w:hAnsi="Arial" w:cs="Arial"/>
+        </w:rPr>
+      </w:pPr>
+    </w:p>
+    <w:p>
+      <w:pPr>
+        <w:keepNext/>
+        <w:keepLines/>
+        <w:rPr>
+          <w:rFonts w:ascii="Arial" w:hAnsi="Arial" w:cs="Arial"/>
+        </w:rPr>
+      </w:pPr>
+      <w:r>
+        <w:rPr>
+          <w:rFonts w:ascii="Arial" w:hAnsi="Arial" w:cs="Arial"/>
+        </w:rPr>
+        <w:t>__________________________________</w:t>
+      </w:r>
+    </w:p>
+    <w:p>
+      <w:pPr>
+        <w:keepNext/>
+        <w:keepLines/>
+        <w:rPr>
+          <w:rFonts w:ascii="Arial" w:hAnsi="Arial" w:cs="Arial"/>
+          <w:color w:val="FF0000"/>
+        </w:rPr>
+      </w:pPr>
+      <w:r>
+        <w:rPr>
+          <w:rFonts w:ascii="Arial" w:hAnsi="Arial" w:cs="Arial"/>
+          <w:color w:val="FF0000"/>
+        </w:rPr>
+        <w:t xml:space="preserve">Claudio Lopes </w:t>
       </w:r>
       <w:proofErr w:type="spellStart"/>
       <w:r>
         <w:rPr>
           <w:rFonts w:ascii="Arial" w:hAnsi="Arial" w:cs="Arial"/>
-        </w:rPr>
-        <w:t>de</w:t>
+          <w:color w:val="FF0000"/>
+        </w:rPr>
+        <w:t>Ferrini</w:t>
       </w:r>
       <w:proofErr w:type="spellEnd"/>
       <w:r>
         <w:rPr>
           <w:rFonts w:ascii="Arial" w:hAnsi="Arial" w:cs="Arial"/>
-        </w:rPr>
-        <w:t xml:space="preserve"> </w:t>
-      </w:r>
-      <w:r>
-        <w:rPr>
-          <w:rFonts w:ascii="Arial" w:hAnsi="Arial" w:cs="Arial"/>
-        </w:rPr>
-        <w:t>202</w:t>
-      </w:r>
-      <w:r>
-        <w:rPr>
-          <w:rFonts w:ascii="Arial" w:hAnsi="Arial" w:cs="Arial"/>
-        </w:rPr>
-        <w:t>__</w:t>
-      </w:r>
-      <w:r>
-        <w:rPr>
-          <w:rFonts w:ascii="Arial" w:hAnsi="Arial" w:cs="Arial"/>
-        </w:rPr>
-        <w:t>_</w:t>
-      </w:r>
-      <w:r>
-        <w:rPr>
-          <w:rFonts w:ascii="Arial" w:hAnsi="Arial" w:cs="Arial"/>
-        </w:rPr>
-        <w:t>.</w:t>
-      </w:r>
-    </w:p>
-    <w:p>
-      <w:pPr>
-        <w:keepNext/>
-        <w:keepLines/>
-        <w:rPr>
-          <w:rFonts w:ascii="Arial" w:hAnsi="Arial" w:cs="Arial"/>
-        </w:rPr>
-      </w:pPr>
-    </w:p>
-    <w:p>
-      <w:pPr>
-        <w:keepNext/>
-        <w:keepLines/>
-        <w:rPr>
-          <w:rFonts w:ascii="Arial" w:hAnsi="Arial" w:cs="Arial"/>
-          <w:b/>
-        </w:rPr>
-      </w:pPr>
-    </w:p>
-    <w:p>
-      <w:pPr>
-        <w:keepNext/>
-        <w:keepLines/>
-        <w:rPr>
-          <w:rFonts w:ascii="Arial" w:hAnsi="Arial" w:cs="Arial"/>
-          <w:b/>
-        </w:rPr>
-      </w:pPr>
-      <w:r>
-        <w:rPr>
-          <w:rFonts w:ascii="Arial" w:hAnsi="Arial" w:cs="Arial"/>
-          <w:b/>
-        </w:rPr>
-        <w:t>Banca Examinadora:</w:t>
-      </w:r>
-    </w:p>
-    <w:p>
-      <w:pPr>
-        <w:keepNext/>
-        <w:keepLines/>
-        <w:rPr>
-          <w:rFonts w:ascii="Arial" w:hAnsi="Arial" w:cs="Arial"/>
-        </w:rPr>
-      </w:pPr>
-    </w:p>
-    <w:p>
-      <w:pPr>
-        <w:keepNext/>
-        <w:keepLines/>
-        <w:rPr>
-          <w:rFonts w:ascii="Arial" w:hAnsi="Arial" w:cs="Arial"/>
-        </w:rPr>
-      </w:pPr>
-    </w:p>
-    <w:p>
-      <w:pPr>
-        <w:keepNext/>
-        <w:keepLines/>
-        <w:rPr>
-          <w:rFonts w:ascii="Arial" w:hAnsi="Arial" w:cs="Arial"/>
+          <w:color w:val="FF0000"/>
+        </w:rPr>
+        <w:t xml:space="preserve"> Garcia (Orientador)</w:t>
+      </w:r>
+    </w:p>
+    <w:p>
+      <w:pPr>
+        <w:keepNext/>
+        <w:keepLines/>
+        <w:rPr>
+          <w:rFonts w:ascii="Arial" w:hAnsi="Arial" w:cs="Arial"/>
+          <w:color w:val="FF0000"/>
+        </w:rPr>
+      </w:pPr>
+      <w:r>
+        <w:rPr>
+          <w:rFonts w:ascii="Arial" w:hAnsi="Arial" w:cs="Arial"/>
+          <w:color w:val="FF0000"/>
+        </w:rPr>
+        <w:t>Maior titulação do orientador</w:t>
+      </w:r>
+    </w:p>
+    <w:p>
+      <w:pPr>
+        <w:keepNext/>
+        <w:keepLines/>
+        <w:rPr>
+          <w:rFonts w:ascii="Arial" w:hAnsi="Arial" w:cs="Arial"/>
+          <w:color w:val="FF0000"/>
+        </w:rPr>
+      </w:pPr>
+      <w:r>
+        <w:rPr>
+          <w:rFonts w:ascii="Arial" w:hAnsi="Arial" w:cs="Arial"/>
+          <w:color w:val="FF0000"/>
+        </w:rPr>
+        <w:t>Etec Prof</w:t>
+      </w:r>
+      <w:r>
+        <w:rPr>
+          <w:rFonts w:ascii="Arial" w:hAnsi="Arial" w:cs="Arial"/>
+          <w:color w:val="FF0000"/>
+        </w:rPr>
+        <w:t>essora</w:t>
+      </w:r>
+      <w:r>
+        <w:rPr>
+          <w:rFonts w:ascii="Arial" w:hAnsi="Arial" w:cs="Arial"/>
+          <w:color w:val="FF0000"/>
+        </w:rPr>
+        <w:t xml:space="preserve"> Ilza Nascimento </w:t>
+      </w:r>
+      <w:proofErr w:type="spellStart"/>
+      <w:r>
+        <w:rPr>
+          <w:rFonts w:ascii="Arial" w:hAnsi="Arial" w:cs="Arial"/>
+          <w:color w:val="FF0000"/>
+        </w:rPr>
+        <w:t>Pintus</w:t>
+      </w:r>
+      <w:proofErr w:type="spellEnd"/>
+    </w:p>
+    <w:p>
+      <w:pPr>
+        <w:keepNext/>
+        <w:keepLines/>
+        <w:rPr>
+          <w:rFonts w:ascii="Arial" w:hAnsi="Arial" w:cs="Arial"/>
+          <w:color w:val="FF0000"/>
+        </w:rPr>
+      </w:pPr>
+    </w:p>
+    <w:p>
+      <w:pPr>
+        <w:keepNext/>
+        <w:keepLines/>
+        <w:rPr>
+          <w:rFonts w:ascii="Arial" w:hAnsi="Arial" w:cs="Arial"/>
+          <w:color w:val="FF0000"/>
+        </w:rPr>
+      </w:pPr>
+    </w:p>
+    <w:p>
+      <w:pPr>
+        <w:keepNext/>
+        <w:keepLines/>
+        <w:rPr>
+          <w:rFonts w:ascii="Arial" w:hAnsi="Arial" w:cs="Arial"/>
+          <w:color w:val="FF0000"/>
         </w:rPr>
       </w:pPr>
     </w:p>
@@ -594,77 +723,97 @@
           <w:rFonts w:ascii="Arial" w:hAnsi="Arial" w:cs="Arial"/>
           <w:color w:val="FF0000"/>
         </w:rPr>
-        <w:t xml:space="preserve">Nome completo do orientador </w:t>
-      </w:r>
-      <w:r>
-        <w:rPr>
-          <w:rFonts w:ascii="Arial" w:hAnsi="Arial" w:cs="Arial"/>
-          <w:color w:val="FF0000"/>
-        </w:rPr>
-        <w:t>(Presidente)</w:t>
-      </w:r>
-    </w:p>
-    <w:p>
-      <w:pPr>
-        <w:keepNext/>
-        <w:keepLines/>
-        <w:rPr>
-          <w:rFonts w:ascii="Arial" w:hAnsi="Arial" w:cs="Arial"/>
-          <w:color w:val="FF0000"/>
-        </w:rPr>
-      </w:pPr>
-      <w:r>
-        <w:rPr>
-          <w:rFonts w:ascii="Arial" w:hAnsi="Arial" w:cs="Arial"/>
-          <w:color w:val="FF0000"/>
-        </w:rPr>
-        <w:t>Maior titulação do orientador</w:t>
-      </w:r>
-    </w:p>
-    <w:p>
-      <w:pPr>
-        <w:keepNext/>
-        <w:keepLines/>
-        <w:rPr>
-          <w:rFonts w:ascii="Arial" w:hAnsi="Arial" w:cs="Arial"/>
-          <w:color w:val="FF0000"/>
-        </w:rPr>
-      </w:pPr>
-      <w:r>
-        <w:rPr>
-          <w:rFonts w:ascii="Arial" w:hAnsi="Arial" w:cs="Arial"/>
-          <w:color w:val="FF0000"/>
-        </w:rPr>
-        <w:t>Instituição de atuação</w:t>
-      </w:r>
-    </w:p>
-    <w:p>
-      <w:pPr>
-        <w:keepNext/>
-        <w:keepLines/>
-        <w:rPr>
-          <w:rFonts w:ascii="Arial" w:hAnsi="Arial" w:cs="Arial"/>
-          <w:color w:val="FF0000"/>
-        </w:rPr>
-      </w:pPr>
-    </w:p>
-    <w:p>
-      <w:pPr>
-        <w:keepNext/>
-        <w:keepLines/>
-        <w:rPr>
-          <w:rFonts w:ascii="Arial" w:hAnsi="Arial" w:cs="Arial"/>
-          <w:color w:val="FF0000"/>
-        </w:rPr>
-      </w:pPr>
-    </w:p>
-    <w:p>
-      <w:pPr>
-        <w:keepNext/>
-        <w:keepLines/>
-        <w:rPr>
-          <w:rFonts w:ascii="Arial" w:hAnsi="Arial" w:cs="Arial"/>
-          <w:color w:val="FF0000"/>
+        <w:t xml:space="preserve">Davi </w:t>
+      </w:r>
+      <w:proofErr w:type="spellStart"/>
+      <w:r>
+        <w:rPr>
+          <w:rFonts w:ascii="Arial" w:hAnsi="Arial" w:cs="Arial"/>
+          <w:color w:val="FF0000"/>
+        </w:rPr>
+        <w:t>Delmondes</w:t>
+      </w:r>
+      <w:proofErr w:type="spellEnd"/>
+      <w:r>
+        <w:rPr>
+          <w:rFonts w:ascii="Arial" w:hAnsi="Arial" w:cs="Arial"/>
+          <w:color w:val="FF0000"/>
+        </w:rPr>
+        <w:t xml:space="preserve"> Machado (Membro)</w:t>
+      </w:r>
+    </w:p>
+    <w:p>
+      <w:pPr>
+        <w:keepNext/>
+        <w:keepLines/>
+        <w:rPr>
+          <w:rFonts w:ascii="Arial" w:hAnsi="Arial" w:cs="Arial"/>
+          <w:color w:val="FF0000"/>
+        </w:rPr>
+      </w:pPr>
+      <w:r>
+        <w:rPr>
+          <w:rFonts w:ascii="Arial" w:hAnsi="Arial" w:cs="Arial"/>
+          <w:color w:val="FF0000"/>
+        </w:rPr>
+        <w:t xml:space="preserve">Maior titulação </w:t>
+      </w:r>
+    </w:p>
+    <w:p>
+      <w:pPr>
+        <w:keepNext/>
+        <w:keepLines/>
+        <w:rPr>
+          <w:rFonts w:ascii="Arial" w:hAnsi="Arial" w:cs="Arial"/>
+          <w:color w:val="FF0000"/>
+        </w:rPr>
+      </w:pPr>
+      <w:r>
+        <w:rPr>
+          <w:rFonts w:ascii="Arial" w:hAnsi="Arial" w:cs="Arial"/>
+          <w:color w:val="FF0000"/>
+        </w:rPr>
+        <w:t>Etec Prof</w:t>
+      </w:r>
+      <w:r>
+        <w:rPr>
+          <w:rFonts w:ascii="Arial" w:hAnsi="Arial" w:cs="Arial"/>
+          <w:color w:val="FF0000"/>
+        </w:rPr>
+        <w:t>essora</w:t>
+      </w:r>
+      <w:r>
+        <w:rPr>
+          <w:rFonts w:ascii="Arial" w:hAnsi="Arial" w:cs="Arial"/>
+          <w:color w:val="FF0000"/>
+        </w:rPr>
+        <w:t xml:space="preserve"> Ilza Nascimento </w:t>
+      </w:r>
+      <w:proofErr w:type="spellStart"/>
+      <w:r>
+        <w:rPr>
+          <w:rFonts w:ascii="Arial" w:hAnsi="Arial" w:cs="Arial"/>
+          <w:color w:val="FF0000"/>
+        </w:rPr>
+        <w:t>Pintus</w:t>
+      </w:r>
+      <w:proofErr w:type="spellEnd"/>
+    </w:p>
+    <w:p>
+      <w:pPr>
+        <w:keepNext/>
+        <w:keepLines/>
+        <w:rPr>
+          <w:rFonts w:ascii="Arial" w:hAnsi="Arial" w:cs="Arial"/>
+        </w:rPr>
+      </w:pPr>
+    </w:p>
+    <w:p>
+      <w:pPr>
+        <w:keepNext/>
+        <w:keepLines/>
+        <w:rPr>
+          <w:rFonts w:ascii="Arial" w:hAnsi="Arial" w:cs="Arial"/>
         </w:rPr>
       </w:pPr>
     </w:p>
@@ -706,14 +855,7 @@
           <w:rFonts w:ascii="Arial" w:hAnsi="Arial" w:cs="Arial"/>
           <w:color w:val="FF0000"/>
         </w:rPr>
-        <w:t>N</w:t>
-      </w:r>
-      <w:r>
-        <w:rPr>
-          <w:rFonts w:ascii="Arial" w:hAnsi="Arial" w:cs="Arial"/>
-          <w:color w:val="FF0000"/>
-        </w:rPr>
-        <w:t>ome completo do membro da banca</w:t>
+        <w:t>Igor de Oliveira Bernardo</w:t>
       </w:r>
       <w:r>
         <w:rPr>
@@ -754,43 +896,59 @@
           <w:rFonts w:ascii="Arial" w:hAnsi="Arial" w:cs="Arial"/>
           <w:color w:val="FF0000"/>
         </w:rPr>
-        <w:t>Instituição de atuação</w:t>
-      </w:r>
-    </w:p>
-    <w:p>
-      <w:pPr>
-        <w:keepNext/>
-        <w:keepLines/>
-        <w:rPr>
-          <w:rFonts w:ascii="Arial" w:hAnsi="Arial" w:cs="Arial"/>
-          <w:color w:val="FF0000"/>
-        </w:rPr>
-      </w:pPr>
-    </w:p>
-    <w:p>
-      <w:pPr>
-        <w:keepNext/>
-        <w:keepLines/>
-        <w:rPr>
-          <w:rFonts w:ascii="Arial" w:hAnsi="Arial" w:cs="Arial"/>
-        </w:rPr>
-      </w:pPr>
-    </w:p>
-    <w:p>
-      <w:pPr>
-        <w:keepNext/>
-        <w:keepLines/>
-        <w:rPr>
-          <w:rFonts w:ascii="Arial" w:hAnsi="Arial" w:cs="Arial"/>
-        </w:rPr>
-      </w:pPr>
-    </w:p>
-    <w:p>
-      <w:pPr>
-        <w:keepNext/>
-        <w:keepLines/>
-        <w:rPr>
-          <w:rFonts w:ascii="Arial" w:hAnsi="Arial" w:cs="Arial"/>
+        <w:t>Etec Prof</w:t>
+      </w:r>
+      <w:r>
+        <w:rPr>
+          <w:rFonts w:ascii="Arial" w:hAnsi="Arial" w:cs="Arial"/>
+          <w:color w:val="FF0000"/>
+        </w:rPr>
+        <w:t>essora</w:t>
+      </w:r>
+      <w:r>
+        <w:rPr>
+          <w:rFonts w:ascii="Arial" w:hAnsi="Arial" w:cs="Arial"/>
+          <w:color w:val="FF0000"/>
+        </w:rPr>
+        <w:t xml:space="preserve"> Ilza Nascimento </w:t>
+      </w:r>
+      <w:proofErr w:type="spellStart"/>
+      <w:r>
+        <w:rPr>
+          <w:rFonts w:ascii="Arial" w:hAnsi="Arial" w:cs="Arial"/>
+          <w:color w:val="FF0000"/>
+        </w:rPr>
+        <w:t>Pintus</w:t>
+      </w:r>
+      <w:proofErr w:type="spellEnd"/>
+    </w:p>
+    <w:p>
+      <w:pPr>
+        <w:keepNext/>
+        <w:keepLines/>
+        <w:rPr>
+          <w:rFonts w:ascii="Arial" w:hAnsi="Arial" w:cs="Arial"/>
+          <w:color w:val="FF0000"/>
+        </w:rPr>
+      </w:pPr>
+    </w:p>
+    <w:p>
+      <w:pPr>
+        <w:keepNext/>
+        <w:keepLines/>
+        <w:rPr>
+          <w:rFonts w:ascii="Arial" w:hAnsi="Arial" w:cs="Arial"/>
+          <w:color w:val="FF0000"/>
+        </w:rPr>
+      </w:pPr>
+    </w:p>
+    <w:p>
+      <w:pPr>
+        <w:keepNext/>
+        <w:keepLines/>
+        <w:rPr>
+          <w:rFonts w:ascii="Arial" w:hAnsi="Arial" w:cs="Arial"/>
+          <w:color w:val="FF0000"/>
         </w:rPr>
       </w:pPr>
     </w:p>
@@ -823,7 +981,14 @@
           <w:rFonts w:ascii="Arial" w:hAnsi="Arial" w:cs="Arial"/>
           <w:color w:val="FF0000"/>
         </w:rPr>
-        <w:t>Nome completo do membro da banca (Membro)</w:t>
+        <w:t>João Pedro Bernardes Cardoso</w:t>
+      </w:r>
+      <w:r>
+        <w:rPr>
+          <w:rFonts w:ascii="Arial" w:hAnsi="Arial" w:cs="Arial"/>
+          <w:color w:val="FF0000"/>
+        </w:rPr>
+        <w:t xml:space="preserve"> (Membro)</w:t>
       </w:r>
     </w:p>
     <w:p>
@@ -848,31 +1013,163 @@
         <w:keepNext/>
         <w:keepLines/>
         <w:rPr>
-          <w:rStyle w:val="apple-style-span"/>
-          <w:rFonts w:ascii="Arial" w:hAnsi="Arial" w:cs="Arial"/>
-          <w:b/>
-          <w:color w:val="000000"/>
-          <w:shd w:val="clear" w:color="auto" w:fill="FFFFFF"/>
-        </w:rPr>
-      </w:pPr>
-      <w:r>
-        <w:rPr>
-          <w:rFonts w:ascii="Arial" w:hAnsi="Arial" w:cs="Arial"/>
-          <w:color w:val="FF0000"/>
-        </w:rPr>
-        <w:t>Instituição de atuação</w:t>
-      </w:r>
-    </w:p>
-    <w:p>
-      <w:pPr>
-        <w:tabs>
-          <w:tab w:val="left" w:pos="3210"/>
-        </w:tabs>
-        <w:jc w:val="center"/>
-        <w:rPr>
-          <w:rFonts w:ascii="Arial" w:hAnsi="Arial" w:cs="Arial"/>
-        </w:rPr>
-      </w:pPr>
+          <w:rFonts w:ascii="Arial" w:hAnsi="Arial" w:cs="Arial"/>
+          <w:color w:val="FF0000"/>
+        </w:rPr>
+      </w:pPr>
+      <w:r>
+        <w:rPr>
+          <w:rFonts w:ascii="Arial" w:hAnsi="Arial" w:cs="Arial"/>
+          <w:color w:val="FF0000"/>
+        </w:rPr>
+        <w:t>Etec Prof</w:t>
+      </w:r>
+      <w:r>
+        <w:rPr>
+          <w:rFonts w:ascii="Arial" w:hAnsi="Arial" w:cs="Arial"/>
+          <w:color w:val="FF0000"/>
+        </w:rPr>
+        <w:t>essora</w:t>
+      </w:r>
+      <w:r>
+        <w:rPr>
+          <w:rFonts w:ascii="Arial" w:hAnsi="Arial" w:cs="Arial"/>
+          <w:color w:val="FF0000"/>
+        </w:rPr>
+        <w:t xml:space="preserve"> Ilza Nascimento </w:t>
+      </w:r>
+      <w:proofErr w:type="spellStart"/>
+      <w:r>
+        <w:rPr>
+          <w:rFonts w:ascii="Arial" w:hAnsi="Arial" w:cs="Arial"/>
+          <w:color w:val="FF0000"/>
+        </w:rPr>
+        <w:t>Pintus</w:t>
+      </w:r>
+      <w:proofErr w:type="spellEnd"/>
+    </w:p>
+    <w:p>
+      <w:pPr>
+        <w:keepNext/>
+        <w:keepLines/>
+        <w:rPr>
+          <w:rFonts w:ascii="Arial" w:hAnsi="Arial" w:cs="Arial"/>
+        </w:rPr>
+      </w:pPr>
+    </w:p>
+    <w:p>
+      <w:pPr>
+        <w:keepNext/>
+        <w:keepLines/>
+        <w:rPr>
+          <w:rFonts w:ascii="Arial" w:hAnsi="Arial" w:cs="Arial"/>
+        </w:rPr>
+      </w:pPr>
+    </w:p>
+    <w:p>
+      <w:pPr>
+        <w:keepNext/>
+        <w:keepLines/>
+        <w:rPr>
+          <w:rFonts w:ascii="Arial" w:hAnsi="Arial" w:cs="Arial"/>
+        </w:rPr>
+      </w:pPr>
+    </w:p>
+    <w:p>
+      <w:pPr>
+        <w:keepNext/>
+        <w:keepLines/>
+        <w:rPr>
+          <w:rFonts w:ascii="Arial" w:hAnsi="Arial" w:cs="Arial"/>
+        </w:rPr>
+      </w:pPr>
+      <w:r>
+        <w:rPr>
+          <w:rFonts w:ascii="Arial" w:hAnsi="Arial" w:cs="Arial"/>
+        </w:rPr>
+        <w:t>__________________________________</w:t>
+      </w:r>
+    </w:p>
+    <w:p>
+      <w:pPr>
+        <w:keepNext/>
+        <w:keepLines/>
+        <w:rPr>
+          <w:rFonts w:ascii="Arial" w:hAnsi="Arial" w:cs="Arial"/>
+          <w:color w:val="FF0000"/>
+        </w:rPr>
+      </w:pPr>
+      <w:r>
+        <w:rPr>
+          <w:rFonts w:ascii="Arial" w:hAnsi="Arial" w:cs="Arial"/>
+          <w:color w:val="FF0000"/>
+        </w:rPr>
+        <w:t>Joaquim Pereira Lima</w:t>
+      </w:r>
+      <w:r>
+        <w:rPr>
+          <w:rFonts w:ascii="Arial" w:hAnsi="Arial" w:cs="Arial"/>
+          <w:color w:val="FF0000"/>
+        </w:rPr>
+        <w:t xml:space="preserve"> (Membro)</w:t>
+      </w:r>
+    </w:p>
+    <w:p>
+      <w:pPr>
+        <w:keepNext/>
+        <w:keepLines/>
+        <w:rPr>
+          <w:rFonts w:ascii="Arial" w:hAnsi="Arial" w:cs="Arial"/>
+          <w:color w:val="FF0000"/>
+        </w:rPr>
+      </w:pPr>
+      <w:r>
+        <w:rPr>
+          <w:rFonts w:ascii="Arial" w:hAnsi="Arial" w:cs="Arial"/>
+          <w:color w:val="FF0000"/>
+        </w:rPr>
+        <w:t xml:space="preserve">Maior titulação </w:t>
+      </w:r>
+    </w:p>
+    <w:p>
+      <w:pPr>
+        <w:keepNext/>
+        <w:keepLines/>
+        <w:rPr>
+          <w:rFonts w:ascii="Arial" w:hAnsi="Arial" w:cs="Arial"/>
+          <w:color w:val="FF0000"/>
+        </w:rPr>
+      </w:pPr>
+      <w:r>
+        <w:rPr>
+          <w:rFonts w:ascii="Arial" w:hAnsi="Arial" w:cs="Arial"/>
+          <w:color w:val="FF0000"/>
+        </w:rPr>
+        <w:t>Etec Prof</w:t>
+      </w:r>
+      <w:r>
+        <w:rPr>
+          <w:rFonts w:ascii="Arial" w:hAnsi="Arial" w:cs="Arial"/>
+          <w:color w:val="FF0000"/>
+        </w:rPr>
+        <w:t>essora</w:t>
+      </w:r>
+      <w:r>
+        <w:rPr>
+          <w:rFonts w:ascii="Arial" w:hAnsi="Arial" w:cs="Arial"/>
+          <w:color w:val="FF0000"/>
+        </w:rPr>
+        <w:t xml:space="preserve"> Ilza Nascimento </w:t>
+      </w:r>
+      <w:proofErr w:type="spellStart"/>
+      <w:r>
+        <w:rPr>
+          <w:rFonts w:ascii="Arial" w:hAnsi="Arial" w:cs="Arial"/>
+          <w:color w:val="FF0000"/>
+        </w:rPr>
+        <w:t>Pintus</w:t>
+      </w:r>
+      <w:proofErr w:type="spellEnd"/>
     </w:p>
     <w:sectPr>
       <w:pgSz w:w="12240" w:h="20160" w:code="5"/>
@@ -1936,6 +2233,21 @@
 </file>
 
 <file path=customXml/item1.xml><?xml version="1.0" encoding="utf-8"?>
+<p:properties xmlns:p="http://schemas.microsoft.com/office/2006/metadata/properties" xmlns:xsi="http://www.w3.org/2001/XMLSchema-instance" xmlns:pc="http://schemas.microsoft.com/office/infopath/2007/PartnerControls">
+  <documentManagement/>
+</p:properties>
+</file>
+
+<file path=customXml/item2.xml><?xml version="1.0" encoding="utf-8"?>
+<?mso-contentType ?>
+<FormTemplates xmlns="http://schemas.microsoft.com/sharepoint/v3/contenttype/forms">
+  <Display>DocumentLibraryForm</Display>
+  <Edit>DocumentLibraryForm</Edit>
+  <New>DocumentLibraryForm</New>
+</FormTemplates>
+</file>
+
+<file path=customXml/item3.xml><?xml version="1.0" encoding="utf-8"?>
 <ct:contentTypeSchema xmlns:ct="http://schemas.microsoft.com/office/2006/metadata/contentType" xmlns:ma="http://schemas.microsoft.com/office/2006/metadata/properties/metaAttributes" ct:_="" ma:_="" ma:contentTypeName="Documento" ma:contentTypeID="0x0101003F0566A92741674FBD407F892C0DFBD9" ma:contentTypeVersion="0" ma:contentTypeDescription="Crie um novo documento." ma:contentTypeScope="" ma:versionID="9992ac1843ecc6d432b1e059444cf595">
   <xsd:schema xmlns:xsd="http://www.w3.org/2001/XMLSchema" xmlns:xs="http://www.w3.org/2001/XMLSchema" xmlns:p="http://schemas.microsoft.com/office/2006/metadata/properties" targetNamespace="http://schemas.microsoft.com/office/2006/metadata/properties" ma:root="true" ma:fieldsID="e257547f92819c86ae4143fe76bb6c5b">
     <xsd:element name="properties">
@@ -2049,32 +2361,10 @@
 </ct:contentTypeSchema>
 </file>
 
-<file path=customXml/item2.xml><?xml version="1.0" encoding="utf-8"?>
-<?mso-contentType ?>
-<FormTemplates xmlns="http://schemas.microsoft.com/sharepoint/v3/contenttype/forms">
-  <Display>DocumentLibraryForm</Display>
-  <Edit>DocumentLibraryForm</Edit>
-  <New>DocumentLibraryForm</New>
-</FormTemplates>
-</file>
-
-<file path=customXml/item3.xml><?xml version="1.0" encoding="utf-8"?>
-<p:properties xmlns:p="http://schemas.microsoft.com/office/2006/metadata/properties" xmlns:xsi="http://www.w3.org/2001/XMLSchema-instance" xmlns:pc="http://schemas.microsoft.com/office/infopath/2007/PartnerControls">
-  <documentManagement/>
-</p:properties>
-</file>
-
 <file path=customXml/itemProps1.xml><?xml version="1.0" encoding="utf-8"?>
-<ds:datastoreItem xmlns:ds="http://schemas.openxmlformats.org/officeDocument/2006/customXml" ds:itemID="{B8223E18-EF6F-45BD-AA12-ABCACC1B8633}">
+<ds:datastoreItem xmlns:ds="http://schemas.openxmlformats.org/officeDocument/2006/customXml" ds:itemID="{9524D6C7-FDD0-48F1-A286-5FDF5DA3AD85}">
   <ds:schemaRefs>
-    <ds:schemaRef ds:uri="http://schemas.microsoft.com/office/2006/metadata/contentType"/>
-    <ds:schemaRef ds:uri="http://schemas.microsoft.com/office/2006/metadata/properties/metaAttributes"/>
-    <ds:schemaRef ds:uri="http://www.w3.org/2001/XMLSchema"/>
     <ds:schemaRef ds:uri="http://schemas.microsoft.com/office/2006/metadata/properties"/>
-    <ds:schemaRef ds:uri="http://schemas.openxmlformats.org/package/2006/metadata/core-properties"/>
-    <ds:schemaRef ds:uri="http://purl.org/dc/elements/1.1/"/>
-    <ds:schemaRef ds:uri="http://purl.org/dc/terms/"/>
-    <ds:schemaRef ds:uri="http://schemas.microsoft.com/internal/obd"/>
     <ds:schemaRef ds:uri="http://schemas.microsoft.com/office/infopath/2007/PartnerControls"/>
   </ds:schemaRefs>
 </ds:datastoreItem>
@@ -2089,9 +2379,16 @@
 </file>
 
 <file path=customXml/itemProps3.xml><?xml version="1.0" encoding="utf-8"?>
-<ds:datastoreItem xmlns:ds="http://schemas.openxmlformats.org/officeDocument/2006/customXml" ds:itemID="{9524D6C7-FDD0-48F1-A286-5FDF5DA3AD85}">
+<ds:datastoreItem xmlns:ds="http://schemas.openxmlformats.org/officeDocument/2006/customXml" ds:itemID="{B8223E18-EF6F-45BD-AA12-ABCACC1B8633}">
   <ds:schemaRefs>
+    <ds:schemaRef ds:uri="http://schemas.microsoft.com/office/2006/metadata/contentType"/>
+    <ds:schemaRef ds:uri="http://schemas.microsoft.com/office/2006/metadata/properties/metaAttributes"/>
+    <ds:schemaRef ds:uri="http://www.w3.org/2001/XMLSchema"/>
     <ds:schemaRef ds:uri="http://schemas.microsoft.com/office/2006/metadata/properties"/>
+    <ds:schemaRef ds:uri="http://schemas.openxmlformats.org/package/2006/metadata/core-properties"/>
+    <ds:schemaRef ds:uri="http://purl.org/dc/elements/1.1/"/>
+    <ds:schemaRef ds:uri="http://purl.org/dc/terms/"/>
+    <ds:schemaRef ds:uri="http://schemas.microsoft.com/internal/obd"/>
     <ds:schemaRef ds:uri="http://schemas.microsoft.com/office/infopath/2007/PartnerControls"/>
   </ds:schemaRefs>
 </ds:datastoreItem>

</xml_diff>